<commit_message>
Insert Persian Sources pp. 4-6 into docx (unity of Guruship, Prithi Chand, Bhai Gurdas)
</commit_message>
<xml_diff>
--- a/История_сикхов_по_персидским_источникам.docx
+++ b/История_сикхов_по_персидским_источникам.docx
@@ -538,6 +538,60 @@
           <w:sz w:val="22"/>
         </w:rPr>
         <w:t xml:space="preserve"> и об изменении отношения самого Гуру Харгобинда к государству.</w:t>
+      </w:r>
+    </w:p>
+    <w:p>
+      <w:pPr>
+        <w:pStyle w:val="Normal"/>
+        <w:rPr/>
+      </w:pPr>
+      <w:r>
+        <w:t xml:space="preserve">Автор «Дабистана» упоминает веру сикхов в единство Гуруства. Дух Гуру Нанака вошёл в тела его преемников — Гуру Ангада, Гуру Амар Даса, Гуру Рам Даса и Гуру Арджана. Вот почему к каждому Гуру обращались как к махалу: Гуру Нанак — первый махал, Гуру Ангад — второй махал, и таким образом Гуру Арджан — пятый махал. Сикх, не почитающий Гуру Арджана как Бабу Нанака, — не истинный сикх. Твёрдое убеждение сикхов состоит в том, что все Гуру — это Нанак. Бхаи Гурдас действительно подчёркивает единство Гуруства от Гуру Нанака до Гуру Хар Гобинда в одном из своих Варов.⁵ Это повторяется в другом Варе, где метафоры света и воды призваны подчеркнуть, что все они — одно и то же.⁶ Идея единства Гуруства, настойчиво проводимая Бхаи Гурдасом, легитимизировала преемство Гуру Хар Гобинда перед лицом соперничающих притязаний Притхи Чанда и его потомков.</w:t>
+      </w:r>
+    </w:p>
+    <w:p>
+      <w:pPr>
+        <w:pStyle w:val="Normal"/>
+        <w:rPr/>
+      </w:pPr>
+      <w:r>
+        <w:t xml:space="preserve">Автор «Дабистана» не обходит стороной притязания Притхи Чанда и его потомков. Он сообщает, что после смерти Гуру Арджана его брат Притхия стал Гуру, и последователи называли его «Гуру Михарбан». В действительности Притхи Чанд был сменён своим сыном Михарбаном как седьмым Гуру. Ко времени написания «Дабистана» преемником Михарбана являлся «Гуру Харджи». Последователи Притхи Чанда считали себя бхагатами — преданными Бога; однако последователи Гуру Хар Гобинда, который тоже претендовал на Гуруство на месте своего отца, называли их мина — что было оскорбительным прозвищем. Бхаи Гурдас смотрит на Притхи Чанда и его преемников как на «мятежников» и «лжегуру»; он осуждает мина в самых отборных выражениях в целом Варе.⁷</w:t>
+      </w:r>
+    </w:p>
+    <w:p>
+      <w:pPr>
+        <w:pStyle w:val="Normal"/>
+        <w:rPr/>
+      </w:pPr>
+      <w:r>
+        <w:t xml:space="preserve">Согласно автору «Дабистана», в сочинениях Гуру Нанака Бог — это Нираньджан, Парабрахм или Пармешвар, не имеющий никакого физического облика, а сам Гуру Нанак — человеческое существо; однако сикхи начали почитать Гуру Нанака как Бога и творца мира. В сочинениях Гуру Нанака Бог — также Гуру (Наставник). Поэтому подразумевается отождествление Гуру и Бога. Тем не менее это отождествление носит метафорический, а не буквальный характер. Вары Бхаи Гурдаса проливают некоторый свет на эту проблему. Гур Парместар эк хаи: Гуру и Бог — одно. Сикх почитает Гуру как Бога. Он живёт в согласии со Словом (сабадом). «Относительно Гуру как Бога», по всей видимости, является ведущей идеей у Бхаи Гурдаса.⁸</w:t>
+      </w:r>
+    </w:p>
+    <w:p>
+      <w:pPr>
+        <w:pStyle w:val="Normal"/>
+        <w:rPr/>
+      </w:pPr>
+      <w:r>
+        <w:t xml:space="preserve">«Дабистан» описывает сочинения Гуру Нанака как исполненные восхвалений Бога и нравственных наставлений. Большая часть его поэзии посвящена величию и чистоте Бога. Всё это было написано на языке джатов — крестьян, относившихся к низшей категории вайшьев Пенджаба. Согласно «Дабистану», Гуру Нанак говорит, что существуют бесчисленные небеса и земли. Набии, аулия, аватары и сиддхи достигли совершенства через преданность Богу. Тот, кто искренне поклоняется Ему, каков бы ни был его путь, обретёт близость к Богу. Ненасилие по отношению к живым существам — средство достижения этой цели. В этом высказывании есть два положения, не находящие подтверждения в сочинениях Гуру Нанака: ахимса и множественность путей к Богу. Автор «Дабистана», по всей видимости, опирался на сведения уважаемых сикхов как на источник информации о сочинениях Гуру Нанака. Примечательно, что он не ссылается ни на Грантх, составленный Гуру Арджаном, ни на сочинения преемников Гуру Нанака, которые сами употребляли эпитет «Нанак» в своих произведениях.</w:t>
+      </w:r>
+    </w:p>
+    <w:p>
+      <w:pPr>
+        <w:pStyle w:val="Normal"/>
+        <w:rPr/>
+      </w:pPr>
+      <w:r>
+        <w:t xml:space="preserve">Бхаи Гурдас обращается к Грантху, составленному Гуру Арджаном, и уравнивает сабад Гуру с самим Гуру: «Почитай сабад Гуру как Гуру; сабад Гуру — воистину Его облик».⁹ Выражение, часто встречающееся в Варах Бхаи Гурдаса применительно к пути Гуру Нанака, — «за пределами Веды и Книги», то есть индийских и семитских священных писаний. Путь Гуру Нанака превосходит все прочие; он — единственная большая дорога в сравнении с многочисленными тропами.¹⁰ Бхаи Гурдас настаивает на исключительной принадлежности к Гуру.¹¹ Автор «Дабистана» упоминает о практике сикхов просить всю общину молиться об исполнении желания отдельного человека. Даже Гуру не был исключением. Подобно Бхаи Гурдасу, автор «Дабистана» использует термин сангат для сикхской общины и дхармсал для сикхского священного пространства. Значение, придаваемое сангату, в полной мере подчёркнуто Бхаи Гурдасом. Собрание благочестивых сикхов (садх-сангат) — это истинная обитель (сачч-кханд) Бога и Бесформенного; Он пребывает в ней; садх-сангат — это обитель Парабрахма Сатгур Пуракха.¹²</w:t>
+      </w:r>
+    </w:p>
+    <w:p>
+      <w:pPr>
+        <w:pStyle w:val="Normal"/>
+        <w:rPr/>
+      </w:pPr>
+      <w:r>
+        <w:t xml:space="preserve">Есть и некоторые другие положения «Дабистана», заслуживающие сопоставления со свидетельствами Бхаи Гурдаса. Например, вера в то, что Гуру Нанак был воплощением Раджи Джанака, фигурирует в...</w:t>
       </w:r>
     </w:p>
     <w:p>

</xml_diff>